<commit_message>
PRACTICA 4 REALIZADA Y CREANDO NUEVO INDEX Y CSS DE NUEVO
</commit_message>
<xml_diff>
--- a/APUNTES.docx
+++ b/APUNTES.docx
@@ -9,120 +9,246 @@
       </w:r>
       <w:proofErr w:type="spellEnd"/>
       <w:r>
-        <w:t xml:space="preserve"> para meter </w:t>
-      </w:r>
-      <w:proofErr w:type="spellStart"/>
-      <w:r>
-        <w:rPr>
-          <w:u w:val="single"/>
-        </w:rPr>
-        <w:t>programacion</w:t>
-      </w:r>
-      <w:proofErr w:type="spellEnd"/>
-      <w:r>
-        <w:t xml:space="preserve"> y generar </w:t>
-      </w:r>
-      <w:proofErr w:type="spellStart"/>
-      <w:r>
-        <w:t>css</w:t>
-      </w:r>
-      <w:proofErr w:type="spellEnd"/>
-      <w:r>
-        <w:t xml:space="preserve"> </w:t>
-      </w:r>
-      <w:r>
-        <w:br/>
-      </w:r>
-      <w:r>
-        <w:t xml:space="preserve">Cada cosa en un archivo en vez de tener todo en el </w:t>
-      </w:r>
-      <w:proofErr w:type="spellStart"/>
-      <w:r>
-        <w:t>layout</w:t>
-      </w:r>
-      <w:proofErr w:type="spellEnd"/>
-      <w:r>
-        <w:t xml:space="preserve"> </w:t>
-      </w:r>
-      <w:r>
-        <w:br/>
-        <w:t xml:space="preserve">usaríamos herencia cuando queramos evolucionar la estructura de la web y </w:t>
-      </w:r>
-      <w:proofErr w:type="spellStart"/>
-      <w:r>
-        <w:t>includes</w:t>
-      </w:r>
-      <w:proofErr w:type="spellEnd"/>
-      <w:r>
-        <w:t xml:space="preserve"> para meter cosas que no se modifican la finalidad es para que siempre que hagas algo lo tengas organizado no te tengas que preocupar de donde se va a colocar el menú solo del menú de como va a ser y sirve para repartir </w:t>
-      </w:r>
-      <w:proofErr w:type="spellStart"/>
-      <w:r>
-        <w:t>eltrabajo</w:t>
-      </w:r>
-      <w:proofErr w:type="spellEnd"/>
-      <w:r>
-        <w:t xml:space="preserve"> y luego todo se junta y </w:t>
-      </w:r>
-      <w:proofErr w:type="spellStart"/>
-      <w:r>
-        <w:t>asi</w:t>
-      </w:r>
-      <w:proofErr w:type="spellEnd"/>
-      <w:r>
-        <w:t xml:space="preserve"> vas a evitar problemas también para luego juntar las ramas.</w:t>
-      </w:r>
-      <w:r>
-        <w:br/>
-      </w:r>
-      <w:r>
-        <w:br/>
-      </w:r>
-      <w:r>
-        <w:t>mi practica no vale por que lo estoy metiendo todo junto no en secciones</w:t>
-      </w:r>
-      <w:r>
-        <w:br/>
-      </w:r>
-      <w:r>
-        <w:br/>
-      </w:r>
-      <w:r>
-        <w:t>dejamos de dividir en archivos cuantos son tan pequeños que no tienen sentido</w:t>
-      </w:r>
-      <w:r>
-        <w:t xml:space="preserve"> y si el archivo ocupa mucho eso seria coger otra paginas ósea </w:t>
-      </w:r>
-      <w:proofErr w:type="spellStart"/>
-      <w:r>
-        <w:t>includes</w:t>
-      </w:r>
-      <w:proofErr w:type="spellEnd"/>
+        <w:t xml:space="preserve"> sirve para poder meter programación en los estilos y luego generar CSS. Cada cosa se puede poner en un archivo propio en vez de tener todo en un CSS gigante. La finalidad es mantener todo organizado y modular.</w:t>
+      </w:r>
     </w:p>
     <w:p>
       <w:r>
-        <w:t xml:space="preserve">Y luego llegas en el </w:t>
-      </w:r>
-      <w:proofErr w:type="spellStart"/>
-      <w:r>
-        <w:t>index</w:t>
-      </w:r>
-      <w:proofErr w:type="spellEnd"/>
-      <w:r>
-        <w:t xml:space="preserve"> y lo cascas el bloque con el </w:t>
-      </w:r>
-      <w:proofErr w:type="spellStart"/>
-      <w:r>
-        <w:t>index</w:t>
-      </w:r>
-      <w:proofErr w:type="spellEnd"/>
-      <w:r>
-        <w:t xml:space="preserve"> que funcionaba bien</w:t>
+        <w:t xml:space="preserve">Se utiliza </w:t>
+      </w:r>
+      <w:r>
+        <w:rPr>
+          <w:b/>
+          <w:bCs/>
+        </w:rPr>
+        <w:t>herencia</w:t>
+      </w:r>
+      <w:r>
+        <w:t xml:space="preserve"> (</w:t>
+      </w:r>
+      <w:proofErr w:type="spellStart"/>
+      <w:r>
+        <w:t>extends</w:t>
+      </w:r>
+      <w:proofErr w:type="spellEnd"/>
+      <w:r>
+        <w:t xml:space="preserve">) cuando queremos evolucionar la estructura de la web, por </w:t>
+      </w:r>
+      <w:proofErr w:type="gramStart"/>
+      <w:r>
+        <w:t>ejemplo</w:t>
+      </w:r>
+      <w:proofErr w:type="gramEnd"/>
+      <w:r>
+        <w:t xml:space="preserve"> cambiar el </w:t>
+      </w:r>
+      <w:proofErr w:type="spellStart"/>
+      <w:r>
+        <w:t>layout</w:t>
+      </w:r>
+      <w:proofErr w:type="spellEnd"/>
+      <w:r>
+        <w:t xml:space="preserve"> general como el </w:t>
+      </w:r>
+      <w:proofErr w:type="spellStart"/>
+      <w:r>
+        <w:t>header</w:t>
+      </w:r>
+      <w:proofErr w:type="spellEnd"/>
+      <w:r>
+        <w:t xml:space="preserve">, el </w:t>
+      </w:r>
+      <w:proofErr w:type="spellStart"/>
+      <w:r>
+        <w:t>footer</w:t>
+      </w:r>
+      <w:proofErr w:type="spellEnd"/>
+      <w:r>
+        <w:t xml:space="preserve"> o el </w:t>
+      </w:r>
+      <w:proofErr w:type="spellStart"/>
+      <w:r>
+        <w:t>main</w:t>
+      </w:r>
+      <w:proofErr w:type="spellEnd"/>
+      <w:r>
+        <w:t xml:space="preserve">. Se utilizan </w:t>
+      </w:r>
+      <w:proofErr w:type="spellStart"/>
+      <w:r>
+        <w:rPr>
+          <w:b/>
+          <w:bCs/>
+        </w:rPr>
+        <w:t>includes</w:t>
+      </w:r>
+      <w:proofErr w:type="spellEnd"/>
+      <w:r>
+        <w:t xml:space="preserve"> para meter bloques que no se van a modificar, como formularios, menús o tablas, de manera que puedas centrarte solo en cómo son esos bloques y no en dónde se colocan en la página. Esto también permite repartir el trabajo en equipo y luego juntar las ramas sin problemas.</w:t>
       </w:r>
     </w:p>
     <w:p>
       <w:r>
-        <w:t xml:space="preserve">Y metes el bloque de block </w:t>
+        <w:t xml:space="preserve">Si la práctica o proyecto no está organizado en secciones, pierde sentido </w:t>
+      </w:r>
+      <w:proofErr w:type="gramStart"/>
+      <w:r>
+        <w:t>la modularidad</w:t>
+      </w:r>
+      <w:proofErr w:type="gramEnd"/>
+      <w:r>
+        <w:t>. Lo ideal es dividir en archivos solo cuando el bloque crece y ocupa mucho, no en trozos demasiado pequeños, porque eso añade complejidad innecesaria. Archivos pequeños se pueden dejar en el mismo archivo principal.</w:t>
+      </w:r>
+    </w:p>
+    <w:p>
+      <w:r>
+        <w:t xml:space="preserve">En </w:t>
+      </w:r>
+      <w:proofErr w:type="spellStart"/>
+      <w:r>
+        <w:t>Pug</w:t>
+      </w:r>
+      <w:proofErr w:type="spellEnd"/>
+      <w:r>
+        <w:t xml:space="preserve"> se trabaja con:</w:t>
+      </w:r>
+    </w:p>
+    <w:p>
+      <w:pPr>
+        <w:numPr>
+          <w:ilvl w:val="0"/>
+          <w:numId w:val="1"/>
+        </w:numPr>
+      </w:pPr>
+      <w:proofErr w:type="spellStart"/>
+      <w:r>
+        <w:rPr>
+          <w:b/>
+          <w:bCs/>
+        </w:rPr>
+        <w:t>extends</w:t>
+      </w:r>
+      <w:proofErr w:type="spellEnd"/>
+      <w:r>
+        <w:t xml:space="preserve">: hereda la estructura de otra plantilla base. Evita repetir código como el head, el </w:t>
+      </w:r>
+      <w:proofErr w:type="spellStart"/>
+      <w:r>
+        <w:t>header</w:t>
+      </w:r>
+      <w:proofErr w:type="spellEnd"/>
+      <w:r>
+        <w:t xml:space="preserve"> o el </w:t>
+      </w:r>
+      <w:proofErr w:type="spellStart"/>
+      <w:r>
+        <w:t>footer</w:t>
+      </w:r>
+      <w:proofErr w:type="spellEnd"/>
+      <w:r>
+        <w:t xml:space="preserve"> en cada página.</w:t>
+      </w:r>
+    </w:p>
+    <w:p>
+      <w:pPr>
+        <w:numPr>
+          <w:ilvl w:val="0"/>
+          <w:numId w:val="1"/>
+        </w:numPr>
+      </w:pPr>
+      <w:r>
+        <w:rPr>
+          <w:b/>
+          <w:bCs/>
+        </w:rPr>
+        <w:t>block</w:t>
+      </w:r>
+      <w:r>
+        <w:t>: espacio reservado en la plantilla base donde se inserta contenido específico de cada página.</w:t>
+      </w:r>
+    </w:p>
+    <w:p>
+      <w:pPr>
+        <w:numPr>
+          <w:ilvl w:val="0"/>
+          <w:numId w:val="1"/>
+        </w:numPr>
+      </w:pPr>
+      <w:proofErr w:type="spellStart"/>
+      <w:r>
+        <w:rPr>
+          <w:b/>
+          <w:bCs/>
+        </w:rPr>
+        <w:t>include</w:t>
+      </w:r>
+      <w:proofErr w:type="spellEnd"/>
+      <w:r>
+        <w:t>: inserta otro archivo dentro del actual. Sirve para reutilizar bloques sin repetir código.</w:t>
+      </w:r>
+    </w:p>
+    <w:p>
+      <w:r>
+        <w:t xml:space="preserve">Trabajando así, cada componente se diseña, se prueba y luego se integra en el </w:t>
+      </w:r>
+      <w:proofErr w:type="spellStart"/>
+      <w:r>
+        <w:t>layout</w:t>
+      </w:r>
+      <w:proofErr w:type="spellEnd"/>
+      <w:r>
+        <w:t xml:space="preserve"> general, manteniendo todo limpio y organizado. Los componentes pueden ser formularios, tablas, botones o cualquier bloque repetible.</w:t>
+      </w:r>
+    </w:p>
+    <w:p>
+      <w:r>
+        <w:t>En la práctica, el flujo sería:</w:t>
+      </w:r>
+    </w:p>
+    <w:p>
+      <w:pPr>
+        <w:numPr>
+          <w:ilvl w:val="0"/>
+          <w:numId w:val="2"/>
+        </w:numPr>
+      </w:pPr>
+      <w:r>
+        <w:t xml:space="preserve">Crear la plantilla base con </w:t>
+      </w:r>
+      <w:proofErr w:type="spellStart"/>
+      <w:r>
+        <w:t>header</w:t>
+      </w:r>
+      <w:proofErr w:type="spellEnd"/>
+      <w:r>
+        <w:t xml:space="preserve">, </w:t>
+      </w:r>
+      <w:proofErr w:type="spellStart"/>
+      <w:r>
+        <w:t>main</w:t>
+      </w:r>
+      <w:proofErr w:type="spellEnd"/>
+      <w:r>
+        <w:t xml:space="preserve"> y </w:t>
+      </w:r>
+      <w:proofErr w:type="spellStart"/>
+      <w:r>
+        <w:t>footer</w:t>
+      </w:r>
+      <w:proofErr w:type="spellEnd"/>
+      <w:r>
+        <w:t>.</w:t>
+      </w:r>
+    </w:p>
+    <w:p>
+      <w:pPr>
+        <w:numPr>
+          <w:ilvl w:val="0"/>
+          <w:numId w:val="2"/>
+        </w:numPr>
+      </w:pPr>
+      <w:r>
+        <w:t xml:space="preserve">Definir bloques (block </w:t>
       </w:r>
       <w:proofErr w:type="spellStart"/>
       <w:r>
@@ -130,7 +256,29 @@
       </w:r>
       <w:proofErr w:type="spellEnd"/>
       <w:r>
-        <w:t xml:space="preserve"> y en el </w:t>
+        <w:t>) dentro de la plantilla donde se insertarán los componentes.</w:t>
+      </w:r>
+    </w:p>
+    <w:p>
+      <w:pPr>
+        <w:numPr>
+          <w:ilvl w:val="0"/>
+          <w:numId w:val="2"/>
+        </w:numPr>
+      </w:pPr>
+      <w:r>
+        <w:t>Crear los componentes en archivos independientes si son grandes y se van a reutilizar.</w:t>
+      </w:r>
+    </w:p>
+    <w:p>
+      <w:pPr>
+        <w:numPr>
+          <w:ilvl w:val="0"/>
+          <w:numId w:val="2"/>
+        </w:numPr>
+      </w:pPr>
+      <w:r>
+        <w:t xml:space="preserve">En el </w:t>
       </w:r>
       <w:proofErr w:type="spellStart"/>
       <w:r>
@@ -138,7 +286,15 @@
       </w:r>
       <w:proofErr w:type="spellEnd"/>
       <w:r>
-        <w:t xml:space="preserve"> dentro de block </w:t>
+        <w:t xml:space="preserve"> o página principal, hacer </w:t>
+      </w:r>
+      <w:proofErr w:type="spellStart"/>
+      <w:r>
+        <w:t>extends</w:t>
+      </w:r>
+      <w:proofErr w:type="spellEnd"/>
+      <w:r>
+        <w:t xml:space="preserve"> de la plantilla y llenar el bloque </w:t>
       </w:r>
       <w:proofErr w:type="spellStart"/>
       <w:r>
@@ -146,16 +302,7 @@
       </w:r>
       <w:proofErr w:type="spellEnd"/>
       <w:r>
-        <w:t xml:space="preserve"> </w:t>
-      </w:r>
-      <w:r>
-        <w:rPr>
-          <w:u w:val="single"/>
-        </w:rPr>
-        <w:t>los</w:t>
-      </w:r>
-      <w:r>
-        <w:t xml:space="preserve"> </w:t>
+        <w:t xml:space="preserve"> con </w:t>
       </w:r>
       <w:proofErr w:type="spellStart"/>
       <w:r>
@@ -163,47 +310,76 @@
       </w:r>
       <w:proofErr w:type="spellEnd"/>
       <w:r>
-        <w:t xml:space="preserve"> o no o directamente los </w:t>
-      </w:r>
-      <w:proofErr w:type="spellStart"/>
-      <w:r>
-        <w:t>includes</w:t>
-      </w:r>
-      <w:proofErr w:type="spellEnd"/>
-      <w:r>
-        <w:t xml:space="preserve"> dentro del </w:t>
+        <w:t xml:space="preserve"> de los componentes.</w:t>
+      </w:r>
+    </w:p>
+    <w:p>
+      <w:r>
+        <w:t>Ventajas de esta organización:</w:t>
+      </w:r>
+    </w:p>
+    <w:p>
+      <w:pPr>
+        <w:numPr>
+          <w:ilvl w:val="0"/>
+          <w:numId w:val="3"/>
+        </w:numPr>
+      </w:pPr>
+      <w:r>
+        <w:t>Mantiene el proyecto limpio y modular.</w:t>
+      </w:r>
+    </w:p>
+    <w:p>
+      <w:pPr>
+        <w:numPr>
+          <w:ilvl w:val="0"/>
+          <w:numId w:val="3"/>
+        </w:numPr>
+      </w:pPr>
+      <w:r>
+        <w:t>Facilita el trabajo en equipo, ya que cada persona puede trabajar en su componente sin tocar la estructura general.</w:t>
+      </w:r>
+    </w:p>
+    <w:p>
+      <w:pPr>
+        <w:numPr>
+          <w:ilvl w:val="0"/>
+          <w:numId w:val="3"/>
+        </w:numPr>
+      </w:pPr>
+      <w:r>
+        <w:t>Permite evolucionar la estructura de la web sin romper los componentes.</w:t>
+      </w:r>
+    </w:p>
+    <w:p>
+      <w:pPr>
+        <w:numPr>
+          <w:ilvl w:val="0"/>
+          <w:numId w:val="3"/>
+        </w:numPr>
+      </w:pPr>
+      <w:r>
+        <w:t>Evita problemas al juntar ramas de desarrollo o actualizar bloques reutilizados.</w:t>
+      </w:r>
+    </w:p>
+    <w:p>
+      <w:r>
+        <w:t xml:space="preserve">En resumen: se trabaja por componentes para maquetar, cada bloque se planifica y se mantiene independiente. La plantilla </w:t>
       </w:r>
       <w:proofErr w:type="spellStart"/>
       <w:r>
         <w:t>layout</w:t>
       </w:r>
       <w:proofErr w:type="spellEnd"/>
+      <w:r>
+        <w:t xml:space="preserve"> hace de “tabla” de la página y los bloques solo se </w:t>
+      </w:r>
+      <w:r>
+        <w:lastRenderedPageBreak/>
+        <w:t>preocupan de cómo son, no de dónde se colocan. Esto hace que todo sea más profesional y escalable.</w:t>
+      </w:r>
     </w:p>
     <w:p/>
-    <w:p>
-      <w:r>
-        <w:t xml:space="preserve">Trabajamos por componentes para maquetar </w:t>
-      </w:r>
-      <w:proofErr w:type="spellStart"/>
-      <w:r>
-        <w:t>dividmos</w:t>
-      </w:r>
-      <w:proofErr w:type="spellEnd"/>
-      <w:r>
-        <w:t xml:space="preserve"> las cosas en trozo y una vez que la tengas planificada de ahí no te mueves</w:t>
-      </w:r>
-      <w:r>
-        <w:t xml:space="preserve"> como si fuese una tabla que eso es el </w:t>
-      </w:r>
-      <w:proofErr w:type="spellStart"/>
-      <w:r>
-        <w:t>layout</w:t>
-      </w:r>
-      <w:proofErr w:type="spellEnd"/>
-      <w:r>
-        <w:br/>
-      </w:r>
-    </w:p>
     <w:sectPr>
       <w:pgSz w:w="11906" w:h="16838"/>
       <w:pgMar w:top="1417" w:right="1701" w:bottom="1417" w:left="1701" w:header="708" w:footer="708" w:gutter="0"/>
@@ -212,6 +388,431 @@
     </w:sectPr>
   </w:body>
 </w:document>
+</file>
+
+<file path=word/numbering.xml><?xml version="1.0" encoding="utf-8"?>
+<w:numbering xmlns:wpc="http://schemas.microsoft.com/office/word/2010/wordprocessingCanvas" xmlns:cx="http://schemas.microsoft.com/office/drawing/2014/chartex" xmlns:cx1="http://schemas.microsoft.com/office/drawing/2015/9/8/chartex" xmlns:cx2="http://schemas.microsoft.com/office/drawing/2015/10/21/chartex" xmlns:cx3="http://schemas.microsoft.com/office/drawing/2016/5/9/chartex" xmlns:cx4="http://schemas.microsoft.com/office/drawing/2016/5/10/chartex" xmlns:cx5="http://schemas.microsoft.com/office/drawing/2016/5/11/chartex" xmlns:cx6="http://schemas.microsoft.com/office/drawing/2016/5/12/chartex" xmlns:cx7="http://schemas.microsoft.com/office/drawing/2016/5/13/chartex" xmlns:cx8="http://schemas.microsoft.com/office/drawing/2016/5/14/chartex" xmlns:mc="http://schemas.openxmlformats.org/markup-compatibility/2006" xmlns:aink="http://schemas.microsoft.com/office/drawing/2016/ink" xmlns:am3d="http://schemas.microsoft.com/office/drawing/2017/model3d" xmlns:o="urn:schemas-microsoft-com:office:office" xmlns:oel="http://schemas.microsoft.com/office/2019/extlst" xmlns:r="http://schemas.openxmlformats.org/officeDocument/2006/relationships" xmlns:m="http://schemas.openxmlformats.org/officeDocument/2006/math" xmlns:v="urn:schemas-microsoft-com:vml" xmlns:wp14="http://schemas.microsoft.com/office/word/2010/wordprocessingDrawing" xmlns:wp="http://schemas.openxmlformats.org/drawingml/2006/wordprocessingDrawing" xmlns:w10="urn:schemas-microsoft-com:office:word" xmlns:w="http://schemas.openxmlformats.org/wordprocessingml/2006/main" xmlns:w14="http://schemas.microsoft.com/office/word/2010/wordml" xmlns:w15="http://schemas.microsoft.com/office/word/2012/wordml" xmlns:w16cex="http://schemas.microsoft.com/office/word/2018/wordml/cex" xmlns:w16cid="http://schemas.microsoft.com/office/word/2016/wordml/cid" xmlns:w16="http://schemas.microsoft.com/office/word/2018/wordml" xmlns:w16du="http://schemas.microsoft.com/office/word/2023/wordml/word16du" xmlns:w16sdtdh="http://schemas.microsoft.com/office/word/2020/wordml/sdtdatahash" xmlns:w16sdtfl="http://schemas.microsoft.com/office/word/2024/wordml/sdtformatlock" xmlns:w16se="http://schemas.microsoft.com/office/word/2015/wordml/symex" xmlns:wpg="http://schemas.microsoft.com/office/word/2010/wordprocessingGroup" xmlns:wpi="http://schemas.microsoft.com/office/word/2010/wordprocessingInk" xmlns:wne="http://schemas.microsoft.com/office/word/2006/wordml" xmlns:wps="http://schemas.microsoft.com/office/word/2010/wordprocessingShape" mc:Ignorable="w14 w15 w16se w16cid w16 w16cex w16sdtdh w16sdtfl w16du wp14">
+  <w:abstractNum w:abstractNumId="0" w15:restartNumberingAfterBreak="0">
+    <w:nsid w:val="00BD7C73"/>
+    <w:multiLevelType w:val="multilevel"/>
+    <w:tmpl w:val="16A036C0"/>
+    <w:lvl w:ilvl="0">
+      <w:start w:val="1"/>
+      <w:numFmt w:val="bullet"/>
+      <w:lvlText w:val=""/>
+      <w:lvlJc w:val="left"/>
+      <w:pPr>
+        <w:tabs>
+          <w:tab w:val="num" w:pos="720"/>
+        </w:tabs>
+        <w:ind w:left="720" w:hanging="360"/>
+      </w:pPr>
+      <w:rPr>
+        <w:rFonts w:ascii="Symbol" w:hAnsi="Symbol" w:hint="default"/>
+        <w:sz w:val="20"/>
+      </w:rPr>
+    </w:lvl>
+    <w:lvl w:ilvl="1" w:tentative="1">
+      <w:start w:val="1"/>
+      <w:numFmt w:val="bullet"/>
+      <w:lvlText w:val="o"/>
+      <w:lvlJc w:val="left"/>
+      <w:pPr>
+        <w:tabs>
+          <w:tab w:val="num" w:pos="1440"/>
+        </w:tabs>
+        <w:ind w:left="1440" w:hanging="360"/>
+      </w:pPr>
+      <w:rPr>
+        <w:rFonts w:ascii="Courier New" w:hAnsi="Courier New" w:hint="default"/>
+        <w:sz w:val="20"/>
+      </w:rPr>
+    </w:lvl>
+    <w:lvl w:ilvl="2" w:tentative="1">
+      <w:start w:val="1"/>
+      <w:numFmt w:val="bullet"/>
+      <w:lvlText w:val=""/>
+      <w:lvlJc w:val="left"/>
+      <w:pPr>
+        <w:tabs>
+          <w:tab w:val="num" w:pos="2160"/>
+        </w:tabs>
+        <w:ind w:left="2160" w:hanging="360"/>
+      </w:pPr>
+      <w:rPr>
+        <w:rFonts w:ascii="Wingdings" w:hAnsi="Wingdings" w:hint="default"/>
+        <w:sz w:val="20"/>
+      </w:rPr>
+    </w:lvl>
+    <w:lvl w:ilvl="3" w:tentative="1">
+      <w:start w:val="1"/>
+      <w:numFmt w:val="bullet"/>
+      <w:lvlText w:val=""/>
+      <w:lvlJc w:val="left"/>
+      <w:pPr>
+        <w:tabs>
+          <w:tab w:val="num" w:pos="2880"/>
+        </w:tabs>
+        <w:ind w:left="2880" w:hanging="360"/>
+      </w:pPr>
+      <w:rPr>
+        <w:rFonts w:ascii="Wingdings" w:hAnsi="Wingdings" w:hint="default"/>
+        <w:sz w:val="20"/>
+      </w:rPr>
+    </w:lvl>
+    <w:lvl w:ilvl="4" w:tentative="1">
+      <w:start w:val="1"/>
+      <w:numFmt w:val="bullet"/>
+      <w:lvlText w:val=""/>
+      <w:lvlJc w:val="left"/>
+      <w:pPr>
+        <w:tabs>
+          <w:tab w:val="num" w:pos="3600"/>
+        </w:tabs>
+        <w:ind w:left="3600" w:hanging="360"/>
+      </w:pPr>
+      <w:rPr>
+        <w:rFonts w:ascii="Wingdings" w:hAnsi="Wingdings" w:hint="default"/>
+        <w:sz w:val="20"/>
+      </w:rPr>
+    </w:lvl>
+    <w:lvl w:ilvl="5" w:tentative="1">
+      <w:start w:val="1"/>
+      <w:numFmt w:val="bullet"/>
+      <w:lvlText w:val=""/>
+      <w:lvlJc w:val="left"/>
+      <w:pPr>
+        <w:tabs>
+          <w:tab w:val="num" w:pos="4320"/>
+        </w:tabs>
+        <w:ind w:left="4320" w:hanging="360"/>
+      </w:pPr>
+      <w:rPr>
+        <w:rFonts w:ascii="Wingdings" w:hAnsi="Wingdings" w:hint="default"/>
+        <w:sz w:val="20"/>
+      </w:rPr>
+    </w:lvl>
+    <w:lvl w:ilvl="6" w:tentative="1">
+      <w:start w:val="1"/>
+      <w:numFmt w:val="bullet"/>
+      <w:lvlText w:val=""/>
+      <w:lvlJc w:val="left"/>
+      <w:pPr>
+        <w:tabs>
+          <w:tab w:val="num" w:pos="5040"/>
+        </w:tabs>
+        <w:ind w:left="5040" w:hanging="360"/>
+      </w:pPr>
+      <w:rPr>
+        <w:rFonts w:ascii="Wingdings" w:hAnsi="Wingdings" w:hint="default"/>
+        <w:sz w:val="20"/>
+      </w:rPr>
+    </w:lvl>
+    <w:lvl w:ilvl="7" w:tentative="1">
+      <w:start w:val="1"/>
+      <w:numFmt w:val="bullet"/>
+      <w:lvlText w:val=""/>
+      <w:lvlJc w:val="left"/>
+      <w:pPr>
+        <w:tabs>
+          <w:tab w:val="num" w:pos="5760"/>
+        </w:tabs>
+        <w:ind w:left="5760" w:hanging="360"/>
+      </w:pPr>
+      <w:rPr>
+        <w:rFonts w:ascii="Wingdings" w:hAnsi="Wingdings" w:hint="default"/>
+        <w:sz w:val="20"/>
+      </w:rPr>
+    </w:lvl>
+    <w:lvl w:ilvl="8" w:tentative="1">
+      <w:start w:val="1"/>
+      <w:numFmt w:val="bullet"/>
+      <w:lvlText w:val=""/>
+      <w:lvlJc w:val="left"/>
+      <w:pPr>
+        <w:tabs>
+          <w:tab w:val="num" w:pos="6480"/>
+        </w:tabs>
+        <w:ind w:left="6480" w:hanging="360"/>
+      </w:pPr>
+      <w:rPr>
+        <w:rFonts w:ascii="Wingdings" w:hAnsi="Wingdings" w:hint="default"/>
+        <w:sz w:val="20"/>
+      </w:rPr>
+    </w:lvl>
+  </w:abstractNum>
+  <w:abstractNum w:abstractNumId="1" w15:restartNumberingAfterBreak="0">
+    <w:nsid w:val="11B73D1B"/>
+    <w:multiLevelType w:val="multilevel"/>
+    <w:tmpl w:val="04CA2B48"/>
+    <w:lvl w:ilvl="0">
+      <w:start w:val="1"/>
+      <w:numFmt w:val="bullet"/>
+      <w:lvlText w:val=""/>
+      <w:lvlJc w:val="left"/>
+      <w:pPr>
+        <w:tabs>
+          <w:tab w:val="num" w:pos="720"/>
+        </w:tabs>
+        <w:ind w:left="720" w:hanging="360"/>
+      </w:pPr>
+      <w:rPr>
+        <w:rFonts w:ascii="Symbol" w:hAnsi="Symbol" w:hint="default"/>
+        <w:sz w:val="20"/>
+      </w:rPr>
+    </w:lvl>
+    <w:lvl w:ilvl="1" w:tentative="1">
+      <w:start w:val="1"/>
+      <w:numFmt w:val="bullet"/>
+      <w:lvlText w:val="o"/>
+      <w:lvlJc w:val="left"/>
+      <w:pPr>
+        <w:tabs>
+          <w:tab w:val="num" w:pos="1440"/>
+        </w:tabs>
+        <w:ind w:left="1440" w:hanging="360"/>
+      </w:pPr>
+      <w:rPr>
+        <w:rFonts w:ascii="Courier New" w:hAnsi="Courier New" w:hint="default"/>
+        <w:sz w:val="20"/>
+      </w:rPr>
+    </w:lvl>
+    <w:lvl w:ilvl="2" w:tentative="1">
+      <w:start w:val="1"/>
+      <w:numFmt w:val="bullet"/>
+      <w:lvlText w:val=""/>
+      <w:lvlJc w:val="left"/>
+      <w:pPr>
+        <w:tabs>
+          <w:tab w:val="num" w:pos="2160"/>
+        </w:tabs>
+        <w:ind w:left="2160" w:hanging="360"/>
+      </w:pPr>
+      <w:rPr>
+        <w:rFonts w:ascii="Wingdings" w:hAnsi="Wingdings" w:hint="default"/>
+        <w:sz w:val="20"/>
+      </w:rPr>
+    </w:lvl>
+    <w:lvl w:ilvl="3" w:tentative="1">
+      <w:start w:val="1"/>
+      <w:numFmt w:val="bullet"/>
+      <w:lvlText w:val=""/>
+      <w:lvlJc w:val="left"/>
+      <w:pPr>
+        <w:tabs>
+          <w:tab w:val="num" w:pos="2880"/>
+        </w:tabs>
+        <w:ind w:left="2880" w:hanging="360"/>
+      </w:pPr>
+      <w:rPr>
+        <w:rFonts w:ascii="Wingdings" w:hAnsi="Wingdings" w:hint="default"/>
+        <w:sz w:val="20"/>
+      </w:rPr>
+    </w:lvl>
+    <w:lvl w:ilvl="4" w:tentative="1">
+      <w:start w:val="1"/>
+      <w:numFmt w:val="bullet"/>
+      <w:lvlText w:val=""/>
+      <w:lvlJc w:val="left"/>
+      <w:pPr>
+        <w:tabs>
+          <w:tab w:val="num" w:pos="3600"/>
+        </w:tabs>
+        <w:ind w:left="3600" w:hanging="360"/>
+      </w:pPr>
+      <w:rPr>
+        <w:rFonts w:ascii="Wingdings" w:hAnsi="Wingdings" w:hint="default"/>
+        <w:sz w:val="20"/>
+      </w:rPr>
+    </w:lvl>
+    <w:lvl w:ilvl="5" w:tentative="1">
+      <w:start w:val="1"/>
+      <w:numFmt w:val="bullet"/>
+      <w:lvlText w:val=""/>
+      <w:lvlJc w:val="left"/>
+      <w:pPr>
+        <w:tabs>
+          <w:tab w:val="num" w:pos="4320"/>
+        </w:tabs>
+        <w:ind w:left="4320" w:hanging="360"/>
+      </w:pPr>
+      <w:rPr>
+        <w:rFonts w:ascii="Wingdings" w:hAnsi="Wingdings" w:hint="default"/>
+        <w:sz w:val="20"/>
+      </w:rPr>
+    </w:lvl>
+    <w:lvl w:ilvl="6" w:tentative="1">
+      <w:start w:val="1"/>
+      <w:numFmt w:val="bullet"/>
+      <w:lvlText w:val=""/>
+      <w:lvlJc w:val="left"/>
+      <w:pPr>
+        <w:tabs>
+          <w:tab w:val="num" w:pos="5040"/>
+        </w:tabs>
+        <w:ind w:left="5040" w:hanging="360"/>
+      </w:pPr>
+      <w:rPr>
+        <w:rFonts w:ascii="Wingdings" w:hAnsi="Wingdings" w:hint="default"/>
+        <w:sz w:val="20"/>
+      </w:rPr>
+    </w:lvl>
+    <w:lvl w:ilvl="7" w:tentative="1">
+      <w:start w:val="1"/>
+      <w:numFmt w:val="bullet"/>
+      <w:lvlText w:val=""/>
+      <w:lvlJc w:val="left"/>
+      <w:pPr>
+        <w:tabs>
+          <w:tab w:val="num" w:pos="5760"/>
+        </w:tabs>
+        <w:ind w:left="5760" w:hanging="360"/>
+      </w:pPr>
+      <w:rPr>
+        <w:rFonts w:ascii="Wingdings" w:hAnsi="Wingdings" w:hint="default"/>
+        <w:sz w:val="20"/>
+      </w:rPr>
+    </w:lvl>
+    <w:lvl w:ilvl="8" w:tentative="1">
+      <w:start w:val="1"/>
+      <w:numFmt w:val="bullet"/>
+      <w:lvlText w:val=""/>
+      <w:lvlJc w:val="left"/>
+      <w:pPr>
+        <w:tabs>
+          <w:tab w:val="num" w:pos="6480"/>
+        </w:tabs>
+        <w:ind w:left="6480" w:hanging="360"/>
+      </w:pPr>
+      <w:rPr>
+        <w:rFonts w:ascii="Wingdings" w:hAnsi="Wingdings" w:hint="default"/>
+        <w:sz w:val="20"/>
+      </w:rPr>
+    </w:lvl>
+  </w:abstractNum>
+  <w:abstractNum w:abstractNumId="2" w15:restartNumberingAfterBreak="0">
+    <w:nsid w:val="512B1767"/>
+    <w:multiLevelType w:val="multilevel"/>
+    <w:tmpl w:val="000E6B62"/>
+    <w:lvl w:ilvl="0">
+      <w:start w:val="1"/>
+      <w:numFmt w:val="decimal"/>
+      <w:lvlText w:val="%1."/>
+      <w:lvlJc w:val="left"/>
+      <w:pPr>
+        <w:tabs>
+          <w:tab w:val="num" w:pos="720"/>
+        </w:tabs>
+        <w:ind w:left="720" w:hanging="360"/>
+      </w:pPr>
+    </w:lvl>
+    <w:lvl w:ilvl="1" w:tentative="1">
+      <w:start w:val="1"/>
+      <w:numFmt w:val="decimal"/>
+      <w:lvlText w:val="%2."/>
+      <w:lvlJc w:val="left"/>
+      <w:pPr>
+        <w:tabs>
+          <w:tab w:val="num" w:pos="1440"/>
+        </w:tabs>
+        <w:ind w:left="1440" w:hanging="360"/>
+      </w:pPr>
+    </w:lvl>
+    <w:lvl w:ilvl="2" w:tentative="1">
+      <w:start w:val="1"/>
+      <w:numFmt w:val="decimal"/>
+      <w:lvlText w:val="%3."/>
+      <w:lvlJc w:val="left"/>
+      <w:pPr>
+        <w:tabs>
+          <w:tab w:val="num" w:pos="2160"/>
+        </w:tabs>
+        <w:ind w:left="2160" w:hanging="360"/>
+      </w:pPr>
+    </w:lvl>
+    <w:lvl w:ilvl="3" w:tentative="1">
+      <w:start w:val="1"/>
+      <w:numFmt w:val="decimal"/>
+      <w:lvlText w:val="%4."/>
+      <w:lvlJc w:val="left"/>
+      <w:pPr>
+        <w:tabs>
+          <w:tab w:val="num" w:pos="2880"/>
+        </w:tabs>
+        <w:ind w:left="2880" w:hanging="360"/>
+      </w:pPr>
+    </w:lvl>
+    <w:lvl w:ilvl="4" w:tentative="1">
+      <w:start w:val="1"/>
+      <w:numFmt w:val="decimal"/>
+      <w:lvlText w:val="%5."/>
+      <w:lvlJc w:val="left"/>
+      <w:pPr>
+        <w:tabs>
+          <w:tab w:val="num" w:pos="3600"/>
+        </w:tabs>
+        <w:ind w:left="3600" w:hanging="360"/>
+      </w:pPr>
+    </w:lvl>
+    <w:lvl w:ilvl="5" w:tentative="1">
+      <w:start w:val="1"/>
+      <w:numFmt w:val="decimal"/>
+      <w:lvlText w:val="%6."/>
+      <w:lvlJc w:val="left"/>
+      <w:pPr>
+        <w:tabs>
+          <w:tab w:val="num" w:pos="4320"/>
+        </w:tabs>
+        <w:ind w:left="4320" w:hanging="360"/>
+      </w:pPr>
+    </w:lvl>
+    <w:lvl w:ilvl="6" w:tentative="1">
+      <w:start w:val="1"/>
+      <w:numFmt w:val="decimal"/>
+      <w:lvlText w:val="%7."/>
+      <w:lvlJc w:val="left"/>
+      <w:pPr>
+        <w:tabs>
+          <w:tab w:val="num" w:pos="5040"/>
+        </w:tabs>
+        <w:ind w:left="5040" w:hanging="360"/>
+      </w:pPr>
+    </w:lvl>
+    <w:lvl w:ilvl="7" w:tentative="1">
+      <w:start w:val="1"/>
+      <w:numFmt w:val="decimal"/>
+      <w:lvlText w:val="%8."/>
+      <w:lvlJc w:val="left"/>
+      <w:pPr>
+        <w:tabs>
+          <w:tab w:val="num" w:pos="5760"/>
+        </w:tabs>
+        <w:ind w:left="5760" w:hanging="360"/>
+      </w:pPr>
+    </w:lvl>
+    <w:lvl w:ilvl="8" w:tentative="1">
+      <w:start w:val="1"/>
+      <w:numFmt w:val="decimal"/>
+      <w:lvlText w:val="%9."/>
+      <w:lvlJc w:val="left"/>
+      <w:pPr>
+        <w:tabs>
+          <w:tab w:val="num" w:pos="6480"/>
+        </w:tabs>
+        <w:ind w:left="6480" w:hanging="360"/>
+      </w:pPr>
+    </w:lvl>
+  </w:abstractNum>
+  <w:num w:numId="1" w16cid:durableId="1532375028">
+    <w:abstractNumId w:val="0"/>
+  </w:num>
+  <w:num w:numId="2" w16cid:durableId="185606893">
+    <w:abstractNumId w:val="2"/>
+  </w:num>
+  <w:num w:numId="3" w16cid:durableId="1780758502">
+    <w:abstractNumId w:val="1"/>
+  </w:num>
+</w:numbering>
 </file>
 
 <file path=word/styles.xml><?xml version="1.0" encoding="utf-8"?>
@@ -817,7 +1418,6 @@
   <w:style w:type="character" w:default="1" w:styleId="Fuentedeprrafopredeter">
     <w:name w:val="Default Paragraph Font"/>
     <w:uiPriority w:val="1"/>
-    <w:semiHidden/>
     <w:unhideWhenUsed/>
   </w:style>
   <w:style w:type="table" w:default="1" w:styleId="Tablanormal">

</xml_diff>